<commit_message>
Update Prosthesis v1 Application Notes.docx
</commit_message>
<xml_diff>
--- a/Documents/Prosthesis v1 Application Notes.docx
+++ b/Documents/Prosthesis v1 Application Notes.docx
@@ -1377,62 +1377,6 @@
         <w:t>Notes</w:t>
       </w:r>
       <w:bookmarkEnd w:id="0"/>
-    </w:p>
-    <w:p>
-      <w:pPr>
-        <w:numPr>
-          <w:ilvl w:val="0"/>
-          <w:numId w:val="2"/>
-        </w:numPr>
-        <w:ind w:left="360"/>
-      </w:pPr>
-      <w:r>
-        <w:rPr>
-          <w:b/>
-          <w:bCs/>
-          <w:color w:val="FF0000"/>
-        </w:rPr>
-        <w:t>IMPORTANT:</w:t>
-      </w:r>
-      <w:r>
-        <w:t xml:space="preserve"> It was discovered after final experiments that the central member of the Load Cell was upside down, meaning magnets were facing the wrong direction. It didn’t impede experiments as the magnets were still close enough to the sensors to generate decent signal.</w:t>
-      </w:r>
-      <w:r>
-        <w:rPr>
-          <w:b/>
-          <w:bCs/>
-          <w:color w:val="FF0000"/>
-        </w:rPr>
-        <w:t xml:space="preserve"> </w:t>
-      </w:r>
-      <w:r>
-        <w:t>After discovery the central member was flipped to the correct orientation to be used in experiments on other devices.</w:t>
-      </w:r>
-      <w:r>
-        <w:rPr>
-          <w:b/>
-          <w:bCs/>
-        </w:rPr>
-        <w:t xml:space="preserve"> Thus, Load Cell thresholds in this firmware will most likely need to be adjusted </w:t>
-      </w:r>
-      <w:r>
-        <w:rPr>
-          <w:b/>
-          <w:bCs/>
-        </w:rPr>
-        <w:t>for future use</w:t>
-      </w:r>
-      <w:r>
-        <w:t>.</w:t>
-      </w:r>
-      <w:r>
-        <w:rPr>
-          <w:b/>
-          <w:bCs/>
-          <w:color w:val="FF0000"/>
-        </w:rPr>
-        <w:br/>
-      </w:r>
     </w:p>
     <w:p>
       <w:pPr>
@@ -1727,7 +1671,6 @@
       </w:pPr>
       <w:bookmarkStart w:id="2" w:name="_Toc203726512"/>
       <w:r>
-        <w:lastRenderedPageBreak/>
         <w:t>1.2</w:t>
       </w:r>
       <w:r>
@@ -1749,7 +1692,11 @@
         <w:t>All</w:t>
       </w:r>
       <w:r>
-        <w:t xml:space="preserve"> files were built with STM32CubeIDE 1.10.1 with no errors or warnings. Using newer versions of STM32CubeIDE (which may have newer versions of GCC and/or Eclipse) may be stricter on builds yielding errors/warnings</w:t>
+        <w:t xml:space="preserve"> files were built with STM32CubeIDE 1.10.1 with no errors or warnings. Using newer versions of STM32CubeIDE (which may have newer versions of GCC and/or Eclipse) may be stricter on </w:t>
+      </w:r>
+      <w:r>
+        <w:lastRenderedPageBreak/>
+        <w:t>builds yielding errors/warnings</w:t>
       </w:r>
       <w:r>
         <w:t>.</w:t>
@@ -1840,7 +1787,7 @@
           <w:noProof/>
         </w:rPr>
         <w:drawing>
-          <wp:inline distT="0" distB="0" distL="0" distR="0" wp14:anchorId="7CDF1894" wp14:editId="54EFCACD">
+          <wp:inline distT="0" distB="0" distL="0" distR="0" wp14:anchorId="7CDF1894" wp14:editId="46260AD3">
             <wp:extent cx="5719664" cy="7538224"/>
             <wp:effectExtent l="0" t="0" r="0" b="5715"/>
             <wp:docPr id="1512744313" name="Picture 3" descr="A screenshot of a computer screen&#10;&#10;AI-generated content may be incorrect."/>

</xml_diff>